<commit_message>
Polish responsive portfolio layout
</commit_message>
<xml_diff>
--- a/Yingzhi_Huang_Resume.docx
+++ b/Yingzhi_Huang_Resume.docx
@@ -102,7 +102,7 @@
       <w:r>
         <w:rPr>
           <w:rFonts w:hint="eastAsia" w:ascii="Arial" w:hAnsi="Arial"/>
-          <w:color w:val="374151"/>
+          <w:color w:val="0000FF"/>
           <w:sz w:val="17"/>
           <w:lang w:val="en-US" w:eastAsia="zh-CN"/>
         </w:rPr>
@@ -111,16 +111,16 @@
       <w:r>
         <w:rPr>
           <w:rFonts w:hint="eastAsia" w:ascii="Arial" w:hAnsi="Arial"/>
-          <w:color w:val="374151"/>
+          <w:color w:val="0000FF"/>
           <w:sz w:val="17"/>
           <w:lang w:val="en-US" w:eastAsia="zh-CN"/>
         </w:rPr>
-        <w:instrText xml:space="preserve"> HYPERLINK "https://www.geniushuang.cn" </w:instrText>
+        <w:instrText xml:space="preserve"> HYPERLINK "https://www.huangyingzhi.cn/" \l "home" </w:instrText>
       </w:r>
       <w:r>
         <w:rPr>
           <w:rFonts w:hint="eastAsia" w:ascii="Arial" w:hAnsi="Arial"/>
-          <w:color w:val="374151"/>
+          <w:color w:val="0000FF"/>
           <w:sz w:val="17"/>
           <w:lang w:val="en-US" w:eastAsia="zh-CN"/>
         </w:rPr>
@@ -128,8 +128,9 @@
       </w:r>
       <w:r>
         <w:rPr>
-          <w:rStyle w:val="137"/>
+          <w:rStyle w:val="135"/>
           <w:rFonts w:hint="eastAsia" w:ascii="Arial" w:hAnsi="Arial"/>
+          <w:color w:val="0000FF"/>
           <w:sz w:val="17"/>
           <w:lang w:val="en-US" w:eastAsia="zh-CN"/>
         </w:rPr>
@@ -138,7 +139,7 @@
       <w:r>
         <w:rPr>
           <w:rFonts w:hint="eastAsia" w:ascii="Arial" w:hAnsi="Arial"/>
-          <w:color w:val="374151"/>
+          <w:color w:val="0000FF"/>
           <w:sz w:val="17"/>
           <w:lang w:val="en-US" w:eastAsia="zh-CN"/>
         </w:rPr>
@@ -147,10 +148,18 @@
       <w:r>
         <w:rPr>
           <w:rFonts w:ascii="Arial" w:hAnsi="Arial"/>
+          <w:color w:val="0000FF"/>
+          <w:sz w:val="17"/>
+        </w:rPr>
+        <w:t xml:space="preserve"> </w:t>
+      </w:r>
+      <w:r>
+        <w:rPr>
+          <w:rFonts w:ascii="Arial" w:hAnsi="Arial"/>
           <w:color w:val="374151"/>
           <w:sz w:val="17"/>
         </w:rPr>
-        <w:t xml:space="preserve">  |  </w:t>
+        <w:t xml:space="preserve"> |  </w:t>
       </w:r>
       <w:r>
         <w:rPr>
@@ -347,7 +356,16 @@
           <w:rFonts w:ascii="Arial" w:hAnsi="Arial"/>
           <w:sz w:val="17"/>
         </w:rPr>
-        <w:t xml:space="preserve"> with Next.js, React, TypeScript, OpenAI-compatible model APIs, SSE streaming, Supabase/local persistence, structured knowledge bases, runtime evaluation, and connectivity audits. Experienced in turning ambiguous model capabilities into clear demos, reusable workflows, and technical narratives for creators, </w:t>
+        <w:t xml:space="preserve"> with Next.js, React, TypeScript, OpenAI-compatible model APIs, SSE streaming, Supabase/local persistence, structured knowledge bases, runtime evaluation, and connectivity audits. Experienced in turning ambiguous model capabilities into clear demos, reusable workflows, and techni</w:t>
+      </w:r>
+      <w:bookmarkStart w:id="0" w:name="_GoBack"/>
+      <w:bookmarkEnd w:id="0"/>
+      <w:r>
+        <w:rPr>
+          <w:rFonts w:ascii="Arial" w:hAnsi="Arial"/>
+          <w:sz w:val="17"/>
+        </w:rPr>
+        <w:t xml:space="preserve">cal narratives for creators, </w:t>
       </w:r>
       <w:r>
         <w:rPr>
@@ -2627,16 +2645,7 @@
           <w:rFonts w:ascii="Arial" w:hAnsi="Arial"/>
           <w:sz w:val="17"/>
         </w:rPr>
-        <w:t>Mandarin Chinese (native), English (professional w</w:t>
-      </w:r>
-      <w:bookmarkStart w:id="0" w:name="_GoBack"/>
-      <w:bookmarkEnd w:id="0"/>
-      <w:r>
-        <w:rPr>
-          <w:rFonts w:ascii="Arial" w:hAnsi="Arial"/>
-          <w:sz w:val="17"/>
-        </w:rPr>
-        <w:t xml:space="preserve">orking proficiency)  </w:t>
+        <w:t xml:space="preserve">Mandarin Chinese (native), English (professional working proficiency)  </w:t>
       </w:r>
     </w:p>
     <w:sectPr>

</xml_diff>